<commit_message>
feat(laboratorio): los anexos 2 y 3 llevan el estado declarado; agente1 0.5.10 (#57)
El laboratorio aceptó el Anexo 1 y pidió (Maiorano, 27/10) que el equipo
transcriba y marque su estado en los anexos 2 y 3; ellos completan sólo
los comentarios, como checklist. Cambia el reparto del correo del 14/10.

- Anexo 2: nivel por atributo («A - Implementado satisfactoriamente»,
  «B - Implementado con observaciones») y global por factor («Muy bueno»,
  «Bueno»: el peor del factor). Columna de nivel más ancha.
- Anexo 3: una X en MB, B o «Previsto / No es necesario» (No aplica).
  M y «No previsto» quedan para el laboratorio (categoría D).
- Un estado sin casilla fija (C, Remite) hace fallar el volcado.

Anexo 1 sin cambios. Lo desplegado sigue siendo la 0.5.9.

Co-Authored-By: Claude Opus 5.5 <noreply@anthropic.com>
</commit_message>
<xml_diff>
--- a/Documentos/Laboratorio/Entrega/Anexo2-Calidad.docx
+++ b/Documentos/Laboratorio/Entrega/Anexo2-Calidad.docx
@@ -251,11 +251,11 @@
         <w:tblLook w:val="04A0" w:firstRow="1" w:lastRow="0" w:firstColumn="1" w:lastColumn="0" w:noHBand="0" w:noVBand="1"/>
       </w:tblPr>
       <w:tblGrid>
-        <w:gridCol w:w="1829"/>
+        <w:gridCol w:w="1700"/>
         <w:gridCol w:w="1736"/>
-        <w:gridCol w:w="1696"/>
-        <w:gridCol w:w="1556"/>
-        <w:gridCol w:w="2527"/>
+        <w:gridCol w:w="2200"/>
+        <w:gridCol w:w="1500"/>
+        <w:gridCol w:w="2208"/>
       </w:tblGrid>
       <w:tr>
         <w:trPr>
@@ -330,7 +330,7 @@
         </w:trPr>
         <w:tc>
           <w:tcPr>
-            <w:tcW w:w="1838" w:type="dxa"/>
+            <w:tcW w:w="1700" w:type="dxa"/>
             <w:vAlign w:val="center"/>
           </w:tcPr>
           <w:p>
@@ -348,7 +348,7 @@
         </w:tc>
         <w:tc>
           <w:tcPr>
-            <w:tcW w:w="1701" w:type="dxa"/>
+            <w:tcW w:w="1736" w:type="dxa"/>
             <w:vAlign w:val="center"/>
           </w:tcPr>
           <w:p>
@@ -378,7 +378,7 @@
         </w:tc>
         <w:tc>
           <w:tcPr>
-            <w:tcW w:w="1701" w:type="dxa"/>
+            <w:tcW w:w="2200" w:type="dxa"/>
             <w:vAlign w:val="center"/>
           </w:tcPr>
           <w:p>
@@ -396,7 +396,7 @@
         </w:tc>
         <w:tc>
           <w:tcPr>
-            <w:tcW w:w="1559" w:type="dxa"/>
+            <w:tcW w:w="1500" w:type="dxa"/>
           </w:tcPr>
           <w:p>
             <w:pPr>
@@ -413,7 +413,7 @@
         </w:tc>
         <w:tc>
           <w:tcPr>
-            <w:tcW w:w="2545" w:type="dxa"/>
+            <w:tcW w:w="2208" w:type="dxa"/>
             <w:vAlign w:val="center"/>
           </w:tcPr>
           <w:p>
@@ -437,7 +437,7 @@
       <w:tr>
         <w:tc>
           <w:tcPr>
-            <w:tcW w:type="dxa" w:w="1829"/>
+            <w:tcW w:type="dxa" w:w="1700"/>
           </w:tcPr>
           <w:p>
             <w:r>
@@ -457,23 +457,27 @@
         </w:tc>
         <w:tc>
           <w:tcPr>
-            <w:tcW w:type="dxa" w:w="1696"/>
-          </w:tcPr>
-          <w:p>
-            <w:r/>
-          </w:p>
-        </w:tc>
-        <w:tc>
-          <w:tcPr>
-            <w:tcW w:type="dxa" w:w="1556"/>
-          </w:tcPr>
-          <w:p>
-            <w:r/>
-          </w:p>
-        </w:tc>
-        <w:tc>
-          <w:tcPr>
-            <w:tcW w:type="dxa" w:w="2527"/>
+            <w:tcW w:type="dxa" w:w="2200"/>
+          </w:tcPr>
+          <w:p>
+            <w:r>
+              <w:t>A - Implementado satisfactoriamente</w:t>
+            </w:r>
+          </w:p>
+        </w:tc>
+        <w:tc>
+          <w:tcPr>
+            <w:tcW w:type="dxa" w:w="1500"/>
+          </w:tcPr>
+          <w:p>
+            <w:r>
+              <w:t>Muy bueno</w:t>
+            </w:r>
+          </w:p>
+        </w:tc>
+        <w:tc>
+          <w:tcPr>
+            <w:tcW w:type="dxa" w:w="2208"/>
           </w:tcPr>
           <w:p>
             <w:r/>
@@ -483,7 +487,7 @@
       <w:tr>
         <w:tc>
           <w:tcPr>
-            <w:tcW w:type="dxa" w:w="1829"/>
+            <w:tcW w:type="dxa" w:w="1700"/>
           </w:tcPr>
           <w:p>
             <w:r>
@@ -503,23 +507,27 @@
         </w:tc>
         <w:tc>
           <w:tcPr>
-            <w:tcW w:type="dxa" w:w="1696"/>
-          </w:tcPr>
-          <w:p>
-            <w:r/>
-          </w:p>
-        </w:tc>
-        <w:tc>
-          <w:tcPr>
-            <w:tcW w:type="dxa" w:w="1556"/>
-          </w:tcPr>
-          <w:p>
-            <w:r/>
-          </w:p>
-        </w:tc>
-        <w:tc>
-          <w:tcPr>
-            <w:tcW w:type="dxa" w:w="2527"/>
+            <w:tcW w:type="dxa" w:w="2200"/>
+          </w:tcPr>
+          <w:p>
+            <w:r>
+              <w:t>A - Implementado satisfactoriamente</w:t>
+            </w:r>
+          </w:p>
+        </w:tc>
+        <w:tc>
+          <w:tcPr>
+            <w:tcW w:type="dxa" w:w="1500"/>
+          </w:tcPr>
+          <w:p>
+            <w:r>
+              <w:t>Muy bueno</w:t>
+            </w:r>
+          </w:p>
+        </w:tc>
+        <w:tc>
+          <w:tcPr>
+            <w:tcW w:type="dxa" w:w="2208"/>
           </w:tcPr>
           <w:p>
             <w:r/>
@@ -529,7 +537,7 @@
       <w:tr>
         <w:tc>
           <w:tcPr>
-            <w:tcW w:type="dxa" w:w="1829"/>
+            <w:tcW w:type="dxa" w:w="1700"/>
           </w:tcPr>
           <w:p>
             <w:r>
@@ -549,23 +557,27 @@
         </w:tc>
         <w:tc>
           <w:tcPr>
-            <w:tcW w:type="dxa" w:w="1696"/>
-          </w:tcPr>
-          <w:p>
-            <w:r/>
-          </w:p>
-        </w:tc>
-        <w:tc>
-          <w:tcPr>
-            <w:tcW w:type="dxa" w:w="1556"/>
-          </w:tcPr>
-          <w:p>
-            <w:r/>
-          </w:p>
-        </w:tc>
-        <w:tc>
-          <w:tcPr>
-            <w:tcW w:type="dxa" w:w="2527"/>
+            <w:tcW w:type="dxa" w:w="2200"/>
+          </w:tcPr>
+          <w:p>
+            <w:r>
+              <w:t>A - Implementado satisfactoriamente</w:t>
+            </w:r>
+          </w:p>
+        </w:tc>
+        <w:tc>
+          <w:tcPr>
+            <w:tcW w:type="dxa" w:w="1500"/>
+          </w:tcPr>
+          <w:p>
+            <w:r>
+              <w:t>Muy bueno</w:t>
+            </w:r>
+          </w:p>
+        </w:tc>
+        <w:tc>
+          <w:tcPr>
+            <w:tcW w:type="dxa" w:w="2208"/>
           </w:tcPr>
           <w:p>
             <w:r/>
@@ -575,7 +587,7 @@
       <w:tr>
         <w:tc>
           <w:tcPr>
-            <w:tcW w:type="dxa" w:w="1829"/>
+            <w:tcW w:type="dxa" w:w="1700"/>
           </w:tcPr>
           <w:p>
             <w:r>
@@ -595,23 +607,27 @@
         </w:tc>
         <w:tc>
           <w:tcPr>
-            <w:tcW w:type="dxa" w:w="1696"/>
-          </w:tcPr>
-          <w:p>
-            <w:r/>
-          </w:p>
-        </w:tc>
-        <w:tc>
-          <w:tcPr>
-            <w:tcW w:type="dxa" w:w="1556"/>
-          </w:tcPr>
-          <w:p>
-            <w:r/>
-          </w:p>
-        </w:tc>
-        <w:tc>
-          <w:tcPr>
-            <w:tcW w:type="dxa" w:w="2527"/>
+            <w:tcW w:type="dxa" w:w="2200"/>
+          </w:tcPr>
+          <w:p>
+            <w:r>
+              <w:t>A - Implementado satisfactoriamente</w:t>
+            </w:r>
+          </w:p>
+        </w:tc>
+        <w:tc>
+          <w:tcPr>
+            <w:tcW w:type="dxa" w:w="1500"/>
+          </w:tcPr>
+          <w:p>
+            <w:r>
+              <w:t>Muy bueno</w:t>
+            </w:r>
+          </w:p>
+        </w:tc>
+        <w:tc>
+          <w:tcPr>
+            <w:tcW w:type="dxa" w:w="2208"/>
           </w:tcPr>
           <w:p>
             <w:r/>
@@ -621,7 +637,7 @@
       <w:tr>
         <w:tc>
           <w:tcPr>
-            <w:tcW w:type="dxa" w:w="1829"/>
+            <w:tcW w:type="dxa" w:w="1700"/>
           </w:tcPr>
           <w:p>
             <w:r>
@@ -641,23 +657,27 @@
         </w:tc>
         <w:tc>
           <w:tcPr>
-            <w:tcW w:type="dxa" w:w="1696"/>
-          </w:tcPr>
-          <w:p>
-            <w:r/>
-          </w:p>
-        </w:tc>
-        <w:tc>
-          <w:tcPr>
-            <w:tcW w:type="dxa" w:w="1556"/>
-          </w:tcPr>
-          <w:p>
-            <w:r/>
-          </w:p>
-        </w:tc>
-        <w:tc>
-          <w:tcPr>
-            <w:tcW w:type="dxa" w:w="2527"/>
+            <w:tcW w:type="dxa" w:w="2200"/>
+          </w:tcPr>
+          <w:p>
+            <w:r>
+              <w:t>B - Implementado con observaciones (partes en A, B y C; el detalle está en el Anexo 1)</w:t>
+            </w:r>
+          </w:p>
+        </w:tc>
+        <w:tc>
+          <w:tcPr>
+            <w:tcW w:type="dxa" w:w="1500"/>
+          </w:tcPr>
+          <w:p>
+            <w:r>
+              <w:t>Bueno</w:t>
+            </w:r>
+          </w:p>
+        </w:tc>
+        <w:tc>
+          <w:tcPr>
+            <w:tcW w:type="dxa" w:w="2208"/>
           </w:tcPr>
           <w:p>
             <w:r/>
@@ -667,7 +687,7 @@
       <w:tr>
         <w:tc>
           <w:tcPr>
-            <w:tcW w:type="dxa" w:w="1829"/>
+            <w:tcW w:type="dxa" w:w="1700"/>
           </w:tcPr>
           <w:p>
             <w:r>
@@ -687,23 +707,27 @@
         </w:tc>
         <w:tc>
           <w:tcPr>
-            <w:tcW w:type="dxa" w:w="1696"/>
-          </w:tcPr>
-          <w:p>
-            <w:r/>
-          </w:p>
-        </w:tc>
-        <w:tc>
-          <w:tcPr>
-            <w:tcW w:type="dxa" w:w="1556"/>
-          </w:tcPr>
-          <w:p>
-            <w:r/>
-          </w:p>
-        </w:tc>
-        <w:tc>
-          <w:tcPr>
-            <w:tcW w:type="dxa" w:w="2527"/>
+            <w:tcW w:type="dxa" w:w="2200"/>
+          </w:tcPr>
+          <w:p>
+            <w:r>
+              <w:t>A - Implementado satisfactoriamente</w:t>
+            </w:r>
+          </w:p>
+        </w:tc>
+        <w:tc>
+          <w:tcPr>
+            <w:tcW w:type="dxa" w:w="1500"/>
+          </w:tcPr>
+          <w:p>
+            <w:r>
+              <w:t>Muy bueno</w:t>
+            </w:r>
+          </w:p>
+        </w:tc>
+        <w:tc>
+          <w:tcPr>
+            <w:tcW w:type="dxa" w:w="2208"/>
           </w:tcPr>
           <w:p>
             <w:r/>
@@ -713,7 +737,7 @@
       <w:tr>
         <w:tc>
           <w:tcPr>
-            <w:tcW w:type="dxa" w:w="1829"/>
+            <w:tcW w:type="dxa" w:w="1700"/>
           </w:tcPr>
           <w:p>
             <w:r>
@@ -733,23 +757,27 @@
         </w:tc>
         <w:tc>
           <w:tcPr>
-            <w:tcW w:type="dxa" w:w="1696"/>
-          </w:tcPr>
-          <w:p>
-            <w:r/>
-          </w:p>
-        </w:tc>
-        <w:tc>
-          <w:tcPr>
-            <w:tcW w:type="dxa" w:w="1556"/>
-          </w:tcPr>
-          <w:p>
-            <w:r/>
-          </w:p>
-        </w:tc>
-        <w:tc>
-          <w:tcPr>
-            <w:tcW w:type="dxa" w:w="2527"/>
+            <w:tcW w:type="dxa" w:w="2200"/>
+          </w:tcPr>
+          <w:p>
+            <w:r>
+              <w:t>A - Implementado satisfactoriamente</w:t>
+            </w:r>
+          </w:p>
+        </w:tc>
+        <w:tc>
+          <w:tcPr>
+            <w:tcW w:type="dxa" w:w="1500"/>
+          </w:tcPr>
+          <w:p>
+            <w:r>
+              <w:t>Muy bueno</w:t>
+            </w:r>
+          </w:p>
+        </w:tc>
+        <w:tc>
+          <w:tcPr>
+            <w:tcW w:type="dxa" w:w="2208"/>
           </w:tcPr>
           <w:p>
             <w:r/>
@@ -759,7 +787,7 @@
       <w:tr>
         <w:tc>
           <w:tcPr>
-            <w:tcW w:type="dxa" w:w="1829"/>
+            <w:tcW w:type="dxa" w:w="1700"/>
           </w:tcPr>
           <w:p>
             <w:r>
@@ -779,23 +807,27 @@
         </w:tc>
         <w:tc>
           <w:tcPr>
-            <w:tcW w:type="dxa" w:w="1696"/>
-          </w:tcPr>
-          <w:p>
-            <w:r/>
-          </w:p>
-        </w:tc>
-        <w:tc>
-          <w:tcPr>
-            <w:tcW w:type="dxa" w:w="1556"/>
-          </w:tcPr>
-          <w:p>
-            <w:r/>
-          </w:p>
-        </w:tc>
-        <w:tc>
-          <w:tcPr>
-            <w:tcW w:type="dxa" w:w="2527"/>
+            <w:tcW w:type="dxa" w:w="2200"/>
+          </w:tcPr>
+          <w:p>
+            <w:r>
+              <w:t>A - Implementado satisfactoriamente</w:t>
+            </w:r>
+          </w:p>
+        </w:tc>
+        <w:tc>
+          <w:tcPr>
+            <w:tcW w:type="dxa" w:w="1500"/>
+          </w:tcPr>
+          <w:p>
+            <w:r>
+              <w:t>Muy bueno</w:t>
+            </w:r>
+          </w:p>
+        </w:tc>
+        <w:tc>
+          <w:tcPr>
+            <w:tcW w:type="dxa" w:w="2208"/>
           </w:tcPr>
           <w:p>
             <w:r/>
@@ -805,7 +837,7 @@
       <w:tr>
         <w:tc>
           <w:tcPr>
-            <w:tcW w:type="dxa" w:w="1829"/>
+            <w:tcW w:type="dxa" w:w="1700"/>
           </w:tcPr>
           <w:p>
             <w:r>
@@ -825,23 +857,27 @@
         </w:tc>
         <w:tc>
           <w:tcPr>
-            <w:tcW w:type="dxa" w:w="1696"/>
-          </w:tcPr>
-          <w:p>
-            <w:r/>
-          </w:p>
-        </w:tc>
-        <w:tc>
-          <w:tcPr>
-            <w:tcW w:type="dxa" w:w="1556"/>
-          </w:tcPr>
-          <w:p>
-            <w:r/>
-          </w:p>
-        </w:tc>
-        <w:tc>
-          <w:tcPr>
-            <w:tcW w:type="dxa" w:w="2527"/>
+            <w:tcW w:type="dxa" w:w="2200"/>
+          </w:tcPr>
+          <w:p>
+            <w:r>
+              <w:t>A - Implementado satisfactoriamente</w:t>
+            </w:r>
+          </w:p>
+        </w:tc>
+        <w:tc>
+          <w:tcPr>
+            <w:tcW w:type="dxa" w:w="1500"/>
+          </w:tcPr>
+          <w:p>
+            <w:r>
+              <w:t>Muy bueno</w:t>
+            </w:r>
+          </w:p>
+        </w:tc>
+        <w:tc>
+          <w:tcPr>
+            <w:tcW w:type="dxa" w:w="2208"/>
           </w:tcPr>
           <w:p>
             <w:r/>
@@ -851,7 +887,7 @@
       <w:tr>
         <w:tc>
           <w:tcPr>
-            <w:tcW w:type="dxa" w:w="1829"/>
+            <w:tcW w:type="dxa" w:w="1700"/>
           </w:tcPr>
           <w:p>
             <w:r>
@@ -871,23 +907,27 @@
         </w:tc>
         <w:tc>
           <w:tcPr>
-            <w:tcW w:type="dxa" w:w="1696"/>
-          </w:tcPr>
-          <w:p>
-            <w:r/>
-          </w:p>
-        </w:tc>
-        <w:tc>
-          <w:tcPr>
-            <w:tcW w:type="dxa" w:w="1556"/>
-          </w:tcPr>
-          <w:p>
-            <w:r/>
-          </w:p>
-        </w:tc>
-        <w:tc>
-          <w:tcPr>
-            <w:tcW w:type="dxa" w:w="2527"/>
+            <w:tcW w:type="dxa" w:w="2200"/>
+          </w:tcPr>
+          <w:p>
+            <w:r>
+              <w:t>A - Implementado satisfactoriamente</w:t>
+            </w:r>
+          </w:p>
+        </w:tc>
+        <w:tc>
+          <w:tcPr>
+            <w:tcW w:type="dxa" w:w="1500"/>
+          </w:tcPr>
+          <w:p>
+            <w:r>
+              <w:t>Bueno</w:t>
+            </w:r>
+          </w:p>
+        </w:tc>
+        <w:tc>
+          <w:tcPr>
+            <w:tcW w:type="dxa" w:w="2208"/>
           </w:tcPr>
           <w:p>
             <w:r/>
@@ -897,7 +937,7 @@
       <w:tr>
         <w:tc>
           <w:tcPr>
-            <w:tcW w:type="dxa" w:w="1829"/>
+            <w:tcW w:type="dxa" w:w="1700"/>
           </w:tcPr>
           <w:p>
             <w:r>
@@ -917,23 +957,27 @@
         </w:tc>
         <w:tc>
           <w:tcPr>
-            <w:tcW w:type="dxa" w:w="1696"/>
-          </w:tcPr>
-          <w:p>
-            <w:r/>
-          </w:p>
-        </w:tc>
-        <w:tc>
-          <w:tcPr>
-            <w:tcW w:type="dxa" w:w="1556"/>
-          </w:tcPr>
-          <w:p>
-            <w:r/>
-          </w:p>
-        </w:tc>
-        <w:tc>
-          <w:tcPr>
-            <w:tcW w:type="dxa" w:w="2527"/>
+            <w:tcW w:type="dxa" w:w="2200"/>
+          </w:tcPr>
+          <w:p>
+            <w:r>
+              <w:t>B - Implementado con observaciones</w:t>
+            </w:r>
+          </w:p>
+        </w:tc>
+        <w:tc>
+          <w:tcPr>
+            <w:tcW w:type="dxa" w:w="1500"/>
+          </w:tcPr>
+          <w:p>
+            <w:r>
+              <w:t>Bueno</w:t>
+            </w:r>
+          </w:p>
+        </w:tc>
+        <w:tc>
+          <w:tcPr>
+            <w:tcW w:type="dxa" w:w="2208"/>
           </w:tcPr>
           <w:p>
             <w:r/>
@@ -943,7 +987,7 @@
       <w:tr>
         <w:tc>
           <w:tcPr>
-            <w:tcW w:type="dxa" w:w="1829"/>
+            <w:tcW w:type="dxa" w:w="1700"/>
           </w:tcPr>
           <w:p>
             <w:r>
@@ -963,23 +1007,27 @@
         </w:tc>
         <w:tc>
           <w:tcPr>
-            <w:tcW w:type="dxa" w:w="1696"/>
-          </w:tcPr>
-          <w:p>
-            <w:r/>
-          </w:p>
-        </w:tc>
-        <w:tc>
-          <w:tcPr>
-            <w:tcW w:type="dxa" w:w="1556"/>
-          </w:tcPr>
-          <w:p>
-            <w:r/>
-          </w:p>
-        </w:tc>
-        <w:tc>
-          <w:tcPr>
-            <w:tcW w:type="dxa" w:w="2527"/>
+            <w:tcW w:type="dxa" w:w="2200"/>
+          </w:tcPr>
+          <w:p>
+            <w:r>
+              <w:t>A - Implementado satisfactoriamente</w:t>
+            </w:r>
+          </w:p>
+        </w:tc>
+        <w:tc>
+          <w:tcPr>
+            <w:tcW w:type="dxa" w:w="1500"/>
+          </w:tcPr>
+          <w:p>
+            <w:r>
+              <w:t>Bueno</w:t>
+            </w:r>
+          </w:p>
+        </w:tc>
+        <w:tc>
+          <w:tcPr>
+            <w:tcW w:type="dxa" w:w="2208"/>
           </w:tcPr>
           <w:p>
             <w:r/>
@@ -989,7 +1037,7 @@
       <w:tr>
         <w:tc>
           <w:tcPr>
-            <w:tcW w:type="dxa" w:w="1829"/>
+            <w:tcW w:type="dxa" w:w="1700"/>
           </w:tcPr>
           <w:p>
             <w:r>
@@ -1009,23 +1057,27 @@
         </w:tc>
         <w:tc>
           <w:tcPr>
-            <w:tcW w:type="dxa" w:w="1696"/>
-          </w:tcPr>
-          <w:p>
-            <w:r/>
-          </w:p>
-        </w:tc>
-        <w:tc>
-          <w:tcPr>
-            <w:tcW w:type="dxa" w:w="1556"/>
-          </w:tcPr>
-          <w:p>
-            <w:r/>
-          </w:p>
-        </w:tc>
-        <w:tc>
-          <w:tcPr>
-            <w:tcW w:type="dxa" w:w="2527"/>
+            <w:tcW w:type="dxa" w:w="2200"/>
+          </w:tcPr>
+          <w:p>
+            <w:r>
+              <w:t>A - Implementado satisfactoriamente</w:t>
+            </w:r>
+          </w:p>
+        </w:tc>
+        <w:tc>
+          <w:tcPr>
+            <w:tcW w:type="dxa" w:w="1500"/>
+          </w:tcPr>
+          <w:p>
+            <w:r>
+              <w:t>Muy bueno</w:t>
+            </w:r>
+          </w:p>
+        </w:tc>
+        <w:tc>
+          <w:tcPr>
+            <w:tcW w:type="dxa" w:w="2208"/>
           </w:tcPr>
           <w:p>
             <w:r/>
@@ -1035,7 +1087,7 @@
       <w:tr>
         <w:tc>
           <w:tcPr>
-            <w:tcW w:type="dxa" w:w="1829"/>
+            <w:tcW w:type="dxa" w:w="1700"/>
           </w:tcPr>
           <w:p>
             <w:r>
@@ -1055,23 +1107,27 @@
         </w:tc>
         <w:tc>
           <w:tcPr>
-            <w:tcW w:type="dxa" w:w="1696"/>
-          </w:tcPr>
-          <w:p>
-            <w:r/>
-          </w:p>
-        </w:tc>
-        <w:tc>
-          <w:tcPr>
-            <w:tcW w:type="dxa" w:w="1556"/>
-          </w:tcPr>
-          <w:p>
-            <w:r/>
-          </w:p>
-        </w:tc>
-        <w:tc>
-          <w:tcPr>
-            <w:tcW w:type="dxa" w:w="2527"/>
+            <w:tcW w:type="dxa" w:w="2200"/>
+          </w:tcPr>
+          <w:p>
+            <w:r>
+              <w:t>A - Implementado satisfactoriamente</w:t>
+            </w:r>
+          </w:p>
+        </w:tc>
+        <w:tc>
+          <w:tcPr>
+            <w:tcW w:type="dxa" w:w="1500"/>
+          </w:tcPr>
+          <w:p>
+            <w:r>
+              <w:t>Muy bueno</w:t>
+            </w:r>
+          </w:p>
+        </w:tc>
+        <w:tc>
+          <w:tcPr>
+            <w:tcW w:type="dxa" w:w="2208"/>
           </w:tcPr>
           <w:p>
             <w:r/>
@@ -1081,7 +1137,7 @@
       <w:tr>
         <w:tc>
           <w:tcPr>
-            <w:tcW w:type="dxa" w:w="1829"/>
+            <w:tcW w:type="dxa" w:w="1700"/>
           </w:tcPr>
           <w:p>
             <w:r>
@@ -1101,23 +1157,27 @@
         </w:tc>
         <w:tc>
           <w:tcPr>
-            <w:tcW w:type="dxa" w:w="1696"/>
-          </w:tcPr>
-          <w:p>
-            <w:r/>
-          </w:p>
-        </w:tc>
-        <w:tc>
-          <w:tcPr>
-            <w:tcW w:type="dxa" w:w="1556"/>
-          </w:tcPr>
-          <w:p>
-            <w:r/>
-          </w:p>
-        </w:tc>
-        <w:tc>
-          <w:tcPr>
-            <w:tcW w:type="dxa" w:w="2527"/>
+            <w:tcW w:type="dxa" w:w="2200"/>
+          </w:tcPr>
+          <w:p>
+            <w:r>
+              <w:t>A - Implementado satisfactoriamente</w:t>
+            </w:r>
+          </w:p>
+        </w:tc>
+        <w:tc>
+          <w:tcPr>
+            <w:tcW w:type="dxa" w:w="1500"/>
+          </w:tcPr>
+          <w:p>
+            <w:r>
+              <w:t>Muy bueno</w:t>
+            </w:r>
+          </w:p>
+        </w:tc>
+        <w:tc>
+          <w:tcPr>
+            <w:tcW w:type="dxa" w:w="2208"/>
           </w:tcPr>
           <w:p>
             <w:r/>
@@ -1127,7 +1187,7 @@
       <w:tr>
         <w:tc>
           <w:tcPr>
-            <w:tcW w:type="dxa" w:w="1829"/>
+            <w:tcW w:type="dxa" w:w="1700"/>
           </w:tcPr>
           <w:p>
             <w:r>
@@ -1147,23 +1207,27 @@
         </w:tc>
         <w:tc>
           <w:tcPr>
-            <w:tcW w:type="dxa" w:w="1696"/>
-          </w:tcPr>
-          <w:p>
-            <w:r/>
-          </w:p>
-        </w:tc>
-        <w:tc>
-          <w:tcPr>
-            <w:tcW w:type="dxa" w:w="1556"/>
-          </w:tcPr>
-          <w:p>
-            <w:r/>
-          </w:p>
-        </w:tc>
-        <w:tc>
-          <w:tcPr>
-            <w:tcW w:type="dxa" w:w="2527"/>
+            <w:tcW w:type="dxa" w:w="2200"/>
+          </w:tcPr>
+          <w:p>
+            <w:r>
+              <w:t>A - Implementado satisfactoriamente</w:t>
+            </w:r>
+          </w:p>
+        </w:tc>
+        <w:tc>
+          <w:tcPr>
+            <w:tcW w:type="dxa" w:w="1500"/>
+          </w:tcPr>
+          <w:p>
+            <w:r>
+              <w:t>Muy bueno</w:t>
+            </w:r>
+          </w:p>
+        </w:tc>
+        <w:tc>
+          <w:tcPr>
+            <w:tcW w:type="dxa" w:w="2208"/>
           </w:tcPr>
           <w:p>
             <w:r/>
@@ -1173,7 +1237,7 @@
       <w:tr>
         <w:tc>
           <w:tcPr>
-            <w:tcW w:type="dxa" w:w="1829"/>
+            <w:tcW w:type="dxa" w:w="1700"/>
           </w:tcPr>
           <w:p>
             <w:r>
@@ -1193,23 +1257,27 @@
         </w:tc>
         <w:tc>
           <w:tcPr>
-            <w:tcW w:type="dxa" w:w="1696"/>
-          </w:tcPr>
-          <w:p>
-            <w:r/>
-          </w:p>
-        </w:tc>
-        <w:tc>
-          <w:tcPr>
-            <w:tcW w:type="dxa" w:w="1556"/>
-          </w:tcPr>
-          <w:p>
-            <w:r/>
-          </w:p>
-        </w:tc>
-        <w:tc>
-          <w:tcPr>
-            <w:tcW w:type="dxa" w:w="2527"/>
+            <w:tcW w:type="dxa" w:w="2200"/>
+          </w:tcPr>
+          <w:p>
+            <w:r>
+              <w:t>A - Implementado satisfactoriamente</w:t>
+            </w:r>
+          </w:p>
+        </w:tc>
+        <w:tc>
+          <w:tcPr>
+            <w:tcW w:type="dxa" w:w="1500"/>
+          </w:tcPr>
+          <w:p>
+            <w:r>
+              <w:t>Muy bueno</w:t>
+            </w:r>
+          </w:p>
+        </w:tc>
+        <w:tc>
+          <w:tcPr>
+            <w:tcW w:type="dxa" w:w="2208"/>
           </w:tcPr>
           <w:p>
             <w:r/>
@@ -1219,7 +1287,7 @@
       <w:tr>
         <w:tc>
           <w:tcPr>
-            <w:tcW w:type="dxa" w:w="1829"/>
+            <w:tcW w:type="dxa" w:w="1700"/>
           </w:tcPr>
           <w:p>
             <w:r>
@@ -1239,23 +1307,27 @@
         </w:tc>
         <w:tc>
           <w:tcPr>
-            <w:tcW w:type="dxa" w:w="1696"/>
-          </w:tcPr>
-          <w:p>
-            <w:r/>
-          </w:p>
-        </w:tc>
-        <w:tc>
-          <w:tcPr>
-            <w:tcW w:type="dxa" w:w="1556"/>
-          </w:tcPr>
-          <w:p>
-            <w:r/>
-          </w:p>
-        </w:tc>
-        <w:tc>
-          <w:tcPr>
-            <w:tcW w:type="dxa" w:w="2527"/>
+            <w:tcW w:type="dxa" w:w="2200"/>
+          </w:tcPr>
+          <w:p>
+            <w:r>
+              <w:t>A - Implementado satisfactoriamente</w:t>
+            </w:r>
+          </w:p>
+        </w:tc>
+        <w:tc>
+          <w:tcPr>
+            <w:tcW w:type="dxa" w:w="1500"/>
+          </w:tcPr>
+          <w:p>
+            <w:r>
+              <w:t>Muy bueno</w:t>
+            </w:r>
+          </w:p>
+        </w:tc>
+        <w:tc>
+          <w:tcPr>
+            <w:tcW w:type="dxa" w:w="2208"/>
           </w:tcPr>
           <w:p>
             <w:r/>

</xml_diff>